<commit_message>
hoan thanh bai 2
</commit_message>
<xml_diff>
--- a/Tên.docx
+++ b/Tên.docx
@@ -6,17 +6,15 @@
       <w:pPr>
         <w:jc w:val="center"/>
         <w:rPr>
-          <w:rFonts w:ascii="Times New Roman" w:hAnsi="Times New Roman" w:cs="Times New Roman"/>
-          <w:b/>
-          <w:sz w:val="36"/>
-          <w:szCs w:val="36"/>
-        </w:rPr>
-      </w:pPr>
-      <w:r>
-        <w:rPr>
-          <w:rFonts w:ascii="Times New Roman" w:hAnsi="Times New Roman" w:cs="Times New Roman"/>
-          <w:b/>
-          <w:sz w:val="36"/>
+          <w:rFonts w:cs="Times New Roman"/>
+          <w:b/>
+          <w:szCs w:val="36"/>
+        </w:rPr>
+      </w:pPr>
+      <w:r>
+        <w:rPr>
+          <w:rFonts w:cs="Times New Roman"/>
+          <w:b/>
           <w:szCs w:val="36"/>
         </w:rPr>
         <w:t xml:space="preserve">Tên: Nguyễn Thanh Tú </w:t>
@@ -24,9 +22,8 @@
       <w:proofErr w:type="gramStart"/>
       <w:r>
         <w:rPr>
-          <w:rFonts w:ascii="Times New Roman" w:hAnsi="Times New Roman" w:cs="Times New Roman"/>
-          <w:b/>
-          <w:sz w:val="36"/>
+          <w:rFonts w:cs="Times New Roman"/>
+          <w:b/>
           <w:szCs w:val="36"/>
         </w:rPr>
         <w:t>MSSV :22691321</w:t>
@@ -37,17 +34,15 @@
       <w:pPr>
         <w:jc w:val="center"/>
         <w:rPr>
-          <w:rFonts w:ascii="Times New Roman" w:hAnsi="Times New Roman" w:cs="Times New Roman"/>
-          <w:b/>
-          <w:sz w:val="36"/>
-          <w:szCs w:val="36"/>
-        </w:rPr>
-      </w:pPr>
-      <w:r>
-        <w:rPr>
-          <w:rFonts w:ascii="Times New Roman" w:hAnsi="Times New Roman" w:cs="Times New Roman"/>
-          <w:b/>
-          <w:sz w:val="36"/>
+          <w:rFonts w:cs="Times New Roman"/>
+          <w:b/>
+          <w:szCs w:val="36"/>
+        </w:rPr>
+      </w:pPr>
+      <w:r>
+        <w:rPr>
+          <w:rFonts w:cs="Times New Roman"/>
+          <w:b/>
           <w:szCs w:val="36"/>
         </w:rPr>
         <w:t>Tuần 5</w:t>
@@ -56,17 +51,15 @@
     <w:p>
       <w:pPr>
         <w:rPr>
-          <w:rFonts w:ascii="Times New Roman" w:hAnsi="Times New Roman" w:cs="Times New Roman"/>
-          <w:b/>
-          <w:sz w:val="36"/>
-          <w:szCs w:val="36"/>
-        </w:rPr>
-      </w:pPr>
-      <w:r>
-        <w:rPr>
-          <w:rFonts w:ascii="Times New Roman" w:hAnsi="Times New Roman" w:cs="Times New Roman"/>
-          <w:b/>
-          <w:sz w:val="36"/>
+          <w:rFonts w:cs="Times New Roman"/>
+          <w:b/>
+          <w:szCs w:val="36"/>
+        </w:rPr>
+      </w:pPr>
+      <w:r>
+        <w:rPr>
+          <w:rFonts w:cs="Times New Roman"/>
+          <w:b/>
           <w:szCs w:val="36"/>
         </w:rPr>
         <w:t>Phần 2:</w:t>
@@ -75,17 +68,15 @@
     <w:p>
       <w:pPr>
         <w:rPr>
-          <w:rFonts w:ascii="Times New Roman" w:hAnsi="Times New Roman" w:cs="Times New Roman"/>
-          <w:b/>
-          <w:sz w:val="36"/>
-          <w:szCs w:val="36"/>
-        </w:rPr>
-      </w:pPr>
-      <w:r>
-        <w:rPr>
-          <w:rFonts w:ascii="Times New Roman" w:hAnsi="Times New Roman" w:cs="Times New Roman"/>
-          <w:b/>
-          <w:sz w:val="36"/>
+          <w:rFonts w:cs="Times New Roman"/>
+          <w:b/>
+          <w:szCs w:val="36"/>
+        </w:rPr>
+      </w:pPr>
+      <w:r>
+        <w:rPr>
+          <w:rFonts w:cs="Times New Roman"/>
+          <w:b/>
           <w:szCs w:val="36"/>
         </w:rPr>
         <w:t>Bài 1:</w:t>
@@ -94,16 +85,14 @@
     <w:p>
       <w:pPr>
         <w:rPr>
-          <w:rFonts w:ascii="Times New Roman" w:hAnsi="Times New Roman" w:cs="Times New Roman"/>
-          <w:b/>
-          <w:sz w:val="36"/>
-          <w:szCs w:val="36"/>
-        </w:rPr>
-      </w:pPr>
-      <w:r>
-        <w:rPr>
-          <w:rFonts w:ascii="Times New Roman" w:hAnsi="Times New Roman" w:cs="Times New Roman"/>
-          <w:sz w:val="36"/>
+          <w:rFonts w:cs="Times New Roman"/>
+          <w:b/>
+          <w:szCs w:val="36"/>
+        </w:rPr>
+      </w:pPr>
+      <w:r>
+        <w:rPr>
+          <w:rFonts w:cs="Times New Roman"/>
           <w:szCs w:val="36"/>
         </w:rPr>
         <w:t>Chạy một container đơn giản với Docker Compose Yêu cầu: Tạo một container chạy Nginx bằng Docker Compose. Map cổng 8080 của máy host với cổng 80 của container.</w:t>
@@ -112,17 +101,15 @@
     <w:p>
       <w:pPr>
         <w:rPr>
-          <w:rFonts w:ascii="Times New Roman" w:hAnsi="Times New Roman" w:cs="Times New Roman"/>
-          <w:b/>
-          <w:sz w:val="36"/>
-          <w:szCs w:val="36"/>
-        </w:rPr>
-      </w:pPr>
-      <w:r>
-        <w:rPr>
-          <w:rFonts w:ascii="Times New Roman" w:hAnsi="Times New Roman" w:cs="Times New Roman"/>
-          <w:b/>
-          <w:sz w:val="36"/>
+          <w:rFonts w:cs="Times New Roman"/>
+          <w:b/>
+          <w:szCs w:val="36"/>
+        </w:rPr>
+      </w:pPr>
+      <w:r>
+        <w:rPr>
+          <w:rFonts w:cs="Times New Roman"/>
+          <w:b/>
           <w:szCs w:val="36"/>
         </w:rPr>
         <w:t>Viet docker-compose: (chup notepoad do vscode truong lag)</w:t>
@@ -131,9 +118,8 @@
     <w:p>
       <w:pPr>
         <w:rPr>
-          <w:rFonts w:ascii="Times New Roman" w:hAnsi="Times New Roman" w:cs="Times New Roman"/>
-          <w:b/>
-          <w:sz w:val="36"/>
+          <w:rFonts w:cs="Times New Roman"/>
+          <w:b/>
           <w:szCs w:val="36"/>
         </w:rPr>
       </w:pPr>
@@ -181,17 +167,15 @@
     <w:p>
       <w:pPr>
         <w:rPr>
-          <w:rFonts w:ascii="Times New Roman" w:hAnsi="Times New Roman" w:cs="Times New Roman"/>
-          <w:b/>
-          <w:sz w:val="36"/>
-          <w:szCs w:val="36"/>
-        </w:rPr>
-      </w:pPr>
-      <w:r>
-        <w:rPr>
-          <w:rFonts w:ascii="Times New Roman" w:hAnsi="Times New Roman" w:cs="Times New Roman"/>
-          <w:b/>
-          <w:sz w:val="36"/>
+          <w:rFonts w:cs="Times New Roman"/>
+          <w:b/>
+          <w:szCs w:val="36"/>
+        </w:rPr>
+      </w:pPr>
+      <w:r>
+        <w:rPr>
+          <w:rFonts w:cs="Times New Roman"/>
+          <w:b/>
           <w:szCs w:val="36"/>
         </w:rPr>
         <w:t>Chay lenh: docker-compose up -d</w:t>
@@ -200,9 +184,8 @@
     <w:p>
       <w:pPr>
         <w:rPr>
-          <w:rFonts w:ascii="Times New Roman" w:hAnsi="Times New Roman" w:cs="Times New Roman"/>
-          <w:b/>
-          <w:sz w:val="36"/>
+          <w:rFonts w:cs="Times New Roman"/>
+          <w:b/>
           <w:szCs w:val="36"/>
         </w:rPr>
       </w:pPr>
@@ -250,17 +233,15 @@
     <w:p>
       <w:pPr>
         <w:rPr>
-          <w:rFonts w:ascii="Times New Roman" w:hAnsi="Times New Roman" w:cs="Times New Roman"/>
-          <w:b/>
-          <w:sz w:val="36"/>
-          <w:szCs w:val="36"/>
-        </w:rPr>
-      </w:pPr>
-      <w:r>
-        <w:rPr>
-          <w:rFonts w:ascii="Times New Roman" w:hAnsi="Times New Roman" w:cs="Times New Roman"/>
-          <w:b/>
-          <w:sz w:val="36"/>
+          <w:rFonts w:cs="Times New Roman"/>
+          <w:b/>
+          <w:szCs w:val="36"/>
+        </w:rPr>
+      </w:pPr>
+      <w:r>
+        <w:rPr>
+          <w:rFonts w:cs="Times New Roman"/>
+          <w:b/>
           <w:szCs w:val="36"/>
         </w:rPr>
         <w:t>Thu chay trinh duyet:</w:t>
@@ -269,19 +250,17 @@
     <w:p>
       <w:pPr>
         <w:rPr>
-          <w:rFonts w:ascii="Times New Roman" w:hAnsi="Times New Roman" w:cs="Times New Roman"/>
-          <w:b/>
-          <w:sz w:val="36"/>
-          <w:szCs w:val="36"/>
-        </w:rPr>
-      </w:pPr>
-    </w:p>
-    <w:p>
-      <w:pPr>
-        <w:rPr>
-          <w:rFonts w:ascii="Times New Roman" w:hAnsi="Times New Roman" w:cs="Times New Roman"/>
-          <w:b/>
-          <w:sz w:val="36"/>
+          <w:rFonts w:cs="Times New Roman"/>
+          <w:b/>
+          <w:szCs w:val="36"/>
+        </w:rPr>
+      </w:pPr>
+    </w:p>
+    <w:p>
+      <w:pPr>
+        <w:rPr>
+          <w:rFonts w:cs="Times New Roman"/>
+          <w:b/>
           <w:szCs w:val="36"/>
         </w:rPr>
       </w:pPr>
@@ -330,17 +309,15 @@
     <w:p>
       <w:pPr>
         <w:rPr>
-          <w:rFonts w:ascii="Times New Roman" w:hAnsi="Times New Roman" w:cs="Times New Roman"/>
-          <w:b/>
-          <w:sz w:val="36"/>
-          <w:szCs w:val="36"/>
-        </w:rPr>
-      </w:pPr>
-      <w:r>
-        <w:rPr>
-          <w:rFonts w:ascii="Times New Roman" w:hAnsi="Times New Roman" w:cs="Times New Roman"/>
-          <w:b/>
-          <w:sz w:val="36"/>
+          <w:rFonts w:cs="Times New Roman"/>
+          <w:b/>
+          <w:szCs w:val="36"/>
+        </w:rPr>
+      </w:pPr>
+      <w:r>
+        <w:rPr>
+          <w:rFonts w:cs="Times New Roman"/>
+          <w:b/>
           <w:szCs w:val="36"/>
         </w:rPr>
         <w:t>Bài 2:</w:t>
@@ -349,9 +326,262 @@
     <w:p>
       <w:pPr>
         <w:rPr>
-          <w:rFonts w:ascii="Times New Roman" w:hAnsi="Times New Roman" w:cs="Times New Roman"/>
-          <w:b/>
-          <w:sz w:val="36"/>
+          <w:rFonts w:cs="Times New Roman"/>
+          <w:szCs w:val="36"/>
+        </w:rPr>
+      </w:pPr>
+      <w:r>
+        <w:rPr>
+          <w:rFonts w:cs="Times New Roman"/>
+          <w:szCs w:val="36"/>
+        </w:rPr>
+        <w:t>Chạy MySQL với Docker Compose Yêu cầu: Tạo một container chạy MySQL phiên bản 8.0. Đặt username là user, password là password và database là mydb</w:t>
+      </w:r>
+    </w:p>
+    <w:p>
+      <w:pPr>
+        <w:rPr>
+          <w:rFonts w:cs="Times New Roman"/>
+          <w:szCs w:val="36"/>
+        </w:rPr>
+      </w:pPr>
+      <w:r>
+        <w:rPr>
+          <w:rFonts w:cs="Times New Roman"/>
+          <w:szCs w:val="36"/>
+        </w:rPr>
+        <w:t>Viet docker-compose:</w:t>
+      </w:r>
+    </w:p>
+    <w:p>
+      <w:pPr>
+        <w:rPr>
+          <w:rFonts w:cs="Times New Roman"/>
+          <w:szCs w:val="36"/>
+        </w:rPr>
+      </w:pPr>
+      <w:r>
+        <w:rPr>
+          <w:noProof/>
+        </w:rPr>
+        <w:lastRenderedPageBreak/>
+        <w:drawing>
+          <wp:inline distT="0" distB="0" distL="0" distR="0" wp14:anchorId="09CFE68B" wp14:editId="3B54399B">
+            <wp:extent cx="5943600" cy="3074670"/>
+            <wp:effectExtent l="0" t="0" r="0" b="0"/>
+            <wp:docPr id="8" name="Picture 8"/>
+            <wp:cNvGraphicFramePr>
+              <a:graphicFrameLocks xmlns:a="http://schemas.openxmlformats.org/drawingml/2006/main" noChangeAspect="1"/>
+            </wp:cNvGraphicFramePr>
+            <a:graphic xmlns:a="http://schemas.openxmlformats.org/drawingml/2006/main">
+              <a:graphicData uri="http://schemas.openxmlformats.org/drawingml/2006/picture">
+                <pic:pic xmlns:pic="http://schemas.openxmlformats.org/drawingml/2006/picture">
+                  <pic:nvPicPr>
+                    <pic:cNvPr id="1" name=""/>
+                    <pic:cNvPicPr/>
+                  </pic:nvPicPr>
+                  <pic:blipFill>
+                    <a:blip r:embed="rId7"/>
+                    <a:stretch>
+                      <a:fillRect/>
+                    </a:stretch>
+                  </pic:blipFill>
+                  <pic:spPr>
+                    <a:xfrm>
+                      <a:off x="0" y="0"/>
+                      <a:ext cx="5943600" cy="3074670"/>
+                    </a:xfrm>
+                    <a:prstGeom prst="rect">
+                      <a:avLst/>
+                    </a:prstGeom>
+                  </pic:spPr>
+                </pic:pic>
+              </a:graphicData>
+            </a:graphic>
+          </wp:inline>
+        </w:drawing>
+      </w:r>
+    </w:p>
+    <w:p>
+      <w:pPr>
+        <w:rPr>
+          <w:rFonts w:cs="Times New Roman"/>
+          <w:szCs w:val="36"/>
+        </w:rPr>
+      </w:pPr>
+      <w:r>
+        <w:rPr>
+          <w:rFonts w:cs="Times New Roman"/>
+          <w:szCs w:val="36"/>
+        </w:rPr>
+        <w:t>Chay lenh docker-compose up –d</w:t>
+      </w:r>
+    </w:p>
+    <w:p>
+      <w:pPr>
+        <w:rPr>
+          <w:rFonts w:cs="Times New Roman"/>
+          <w:szCs w:val="36"/>
+        </w:rPr>
+      </w:pPr>
+      <w:r>
+        <w:rPr>
+          <w:noProof/>
+        </w:rPr>
+        <w:drawing>
+          <wp:inline distT="0" distB="0" distL="0" distR="0" wp14:anchorId="4B441DCD" wp14:editId="41501D4F">
+            <wp:extent cx="5943600" cy="1991360"/>
+            <wp:effectExtent l="0" t="0" r="0" b="8890"/>
+            <wp:docPr id="10" name="Picture 10"/>
+            <wp:cNvGraphicFramePr>
+              <a:graphicFrameLocks xmlns:a="http://schemas.openxmlformats.org/drawingml/2006/main" noChangeAspect="1"/>
+            </wp:cNvGraphicFramePr>
+            <a:graphic xmlns:a="http://schemas.openxmlformats.org/drawingml/2006/main">
+              <a:graphicData uri="http://schemas.openxmlformats.org/drawingml/2006/picture">
+                <pic:pic xmlns:pic="http://schemas.openxmlformats.org/drawingml/2006/picture">
+                  <pic:nvPicPr>
+                    <pic:cNvPr id="1" name=""/>
+                    <pic:cNvPicPr/>
+                  </pic:nvPicPr>
+                  <pic:blipFill>
+                    <a:blip r:embed="rId8"/>
+                    <a:stretch>
+                      <a:fillRect/>
+                    </a:stretch>
+                  </pic:blipFill>
+                  <pic:spPr>
+                    <a:xfrm>
+                      <a:off x="0" y="0"/>
+                      <a:ext cx="5943600" cy="1991360"/>
+                    </a:xfrm>
+                    <a:prstGeom prst="rect">
+                      <a:avLst/>
+                    </a:prstGeom>
+                  </pic:spPr>
+                </pic:pic>
+              </a:graphicData>
+            </a:graphic>
+          </wp:inline>
+        </w:drawing>
+      </w:r>
+    </w:p>
+    <w:p>
+      <w:pPr>
+        <w:rPr>
+          <w:noProof/>
+        </w:rPr>
+      </w:pPr>
+      <w:r>
+        <w:rPr>
+          <w:noProof/>
+        </w:rPr>
+        <w:t>Vao db:</w:t>
+      </w:r>
+    </w:p>
+    <w:p>
+      <w:pPr>
+        <w:rPr>
+          <w:rFonts w:cs="Times New Roman"/>
+          <w:b/>
+          <w:szCs w:val="36"/>
+        </w:rPr>
+      </w:pPr>
+      <w:r>
+        <w:rPr>
+          <w:noProof/>
+        </w:rPr>
+        <w:lastRenderedPageBreak/>
+        <w:drawing>
+          <wp:inline distT="0" distB="0" distL="0" distR="0" wp14:anchorId="47B48BEA" wp14:editId="0FD4C4E8">
+            <wp:extent cx="5943600" cy="3108960"/>
+            <wp:effectExtent l="0" t="0" r="0" b="0"/>
+            <wp:docPr id="9" name="Picture 9"/>
+            <wp:cNvGraphicFramePr>
+              <a:graphicFrameLocks xmlns:a="http://schemas.openxmlformats.org/drawingml/2006/main" noChangeAspect="1"/>
+            </wp:cNvGraphicFramePr>
+            <a:graphic xmlns:a="http://schemas.openxmlformats.org/drawingml/2006/main">
+              <a:graphicData uri="http://schemas.openxmlformats.org/drawingml/2006/picture">
+                <pic:pic xmlns:pic="http://schemas.openxmlformats.org/drawingml/2006/picture">
+                  <pic:nvPicPr>
+                    <pic:cNvPr id="1" name=""/>
+                    <pic:cNvPicPr/>
+                  </pic:nvPicPr>
+                  <pic:blipFill>
+                    <a:blip r:embed="rId9"/>
+                    <a:stretch>
+                      <a:fillRect/>
+                    </a:stretch>
+                  </pic:blipFill>
+                  <pic:spPr>
+                    <a:xfrm>
+                      <a:off x="0" y="0"/>
+                      <a:ext cx="5943600" cy="3108960"/>
+                    </a:xfrm>
+                    <a:prstGeom prst="rect">
+                      <a:avLst/>
+                    </a:prstGeom>
+                  </pic:spPr>
+                </pic:pic>
+              </a:graphicData>
+            </a:graphic>
+          </wp:inline>
+        </w:drawing>
+      </w:r>
+    </w:p>
+    <w:p>
+      <w:pPr>
+        <w:rPr>
+          <w:rFonts w:cs="Times New Roman"/>
+          <w:b/>
+          <w:szCs w:val="36"/>
+        </w:rPr>
+      </w:pPr>
+      <w:r>
+        <w:rPr>
+          <w:noProof/>
+        </w:rPr>
+        <w:drawing>
+          <wp:inline distT="0" distB="0" distL="0" distR="0" wp14:anchorId="2023914E" wp14:editId="43CCD285">
+            <wp:extent cx="2152650" cy="1943100"/>
+            <wp:effectExtent l="0" t="0" r="0" b="0"/>
+            <wp:docPr id="11" name="Picture 11"/>
+            <wp:cNvGraphicFramePr>
+              <a:graphicFrameLocks xmlns:a="http://schemas.openxmlformats.org/drawingml/2006/main" noChangeAspect="1"/>
+            </wp:cNvGraphicFramePr>
+            <a:graphic xmlns:a="http://schemas.openxmlformats.org/drawingml/2006/main">
+              <a:graphicData uri="http://schemas.openxmlformats.org/drawingml/2006/picture">
+                <pic:pic xmlns:pic="http://schemas.openxmlformats.org/drawingml/2006/picture">
+                  <pic:nvPicPr>
+                    <pic:cNvPr id="1" name=""/>
+                    <pic:cNvPicPr/>
+                  </pic:nvPicPr>
+                  <pic:blipFill>
+                    <a:blip r:embed="rId10"/>
+                    <a:stretch>
+                      <a:fillRect/>
+                    </a:stretch>
+                  </pic:blipFill>
+                  <pic:spPr>
+                    <a:xfrm>
+                      <a:off x="0" y="0"/>
+                      <a:ext cx="2152650" cy="1943100"/>
+                    </a:xfrm>
+                    <a:prstGeom prst="rect">
+                      <a:avLst/>
+                    </a:prstGeom>
+                  </pic:spPr>
+                </pic:pic>
+              </a:graphicData>
+            </a:graphic>
+          </wp:inline>
+        </w:drawing>
+      </w:r>
+    </w:p>
+    <w:p>
+      <w:pPr>
+        <w:rPr>
+          <w:rFonts w:cs="Times New Roman"/>
+          <w:b/>
           <w:szCs w:val="36"/>
         </w:rPr>
       </w:pPr>
@@ -761,6 +991,11 @@
   <w:style w:type="paragraph" w:default="1" w:styleId="Normal">
     <w:name w:val="Normal"/>
     <w:qFormat/>
+    <w:rsid w:val="00F73EA2"/>
+    <w:rPr>
+      <w:rFonts w:ascii="Times New Roman" w:hAnsi="Times New Roman"/>
+      <w:sz w:val="36"/>
+    </w:rPr>
   </w:style>
   <w:style w:type="character" w:default="1" w:styleId="DefaultParagraphFont">
     <w:name w:val="Default Paragraph Font"/>

</xml_diff>